<commit_message>
Remove paid-media mentions from the CID client deck.
Drop copy that told the client they do not invest in ads; recapture the affected slides.

Co-authored-by: sarapizzico-hue <sarapizzico-hue@users.noreply.github.com>
</commit_message>
<xml_diff>
--- a/cid/CID-Empresa-que-Vende.docx
+++ b/cid/CID-Empresa-que-Vende.docx
@@ -82,7 +82,7 @@
                 <w:color w:val="E8D0D0"/>
                 <w:sz w:val="24"/>
               </w:rPr>
-              <w:t>Consultoria, acompanhamento e execução assistida + origem orgânica. Ciclo de 6 meses no cartão de crédito. Sem verba de mídia paga.</w:t>
+              <w:t>Consultoria, acompanhamento e execução assistida + origem orgânica. Ciclo de 6 meses no cartão de crédito.</w:t>
             </w:r>
           </w:p>
         </w:tc>
@@ -1003,7 +1003,7 @@
                 <w:color w:val="1A1A1A"/>
                 <w:sz w:val="22"/>
               </w:rPr>
-              <w:t>A V4 não executa no lugar da CID: estrutura o negócio, treina o time e acompanha a execução. Quem opera é a CID. A máquina fica na empresa quando o ciclo acaba. A ordem é clareza → sistema → execução. SEO Growth entra como origem complementar, sem mídia paga.</w:t>
+              <w:t>A V4 não executa no lugar da CID: estrutura o negócio, treina o time e acompanha a execução. Quem opera é a CID. A máquina fica na empresa quando o ciclo acaba. A ordem é clareza → sistema → execução. SEO Growth entra como origem complementar.</w:t>
             </w:r>
           </w:p>
         </w:tc>
@@ -1045,7 +1045,7 @@
           <w:color w:val="1A1A1A"/>
           <w:sz w:val="22"/>
         </w:rPr>
-        <w:t>Instalar, em 6 meses, o método para a CID vender com previsibilidade: diagnóstico contínuo de maturidade GTM, consultoria estratégica mensal, execução assistida (conteúdo, comercial e CRM) e origem complementar em SEO Growth — sem verba de mídia paga. Comunidade de pares e imersão presencial da Fábrica de Receita.</w:t>
+        <w:t>Instalar, em 6 meses, o método para a CID vender com previsibilidade: diagnóstico contínuo de maturidade GTM, consultoria estratégica mensal, execução assistida (conteúdo, comercial e CRM) e origem complementar em SEO Growth. Comunidade de pares e imersão presencial da Fábrica de Receita.</w:t>
       </w:r>
     </w:p>
     <w:p>
@@ -1354,7 +1354,7 @@
                 <w:color w:val="1A1A1A"/>
                 <w:sz w:val="20"/>
               </w:rPr>
-              <w:t>Marketing no achismo / nunca investiu em mídia</w:t>
+              <w:t>Marketing no achismo</w:t>
             </w:r>
           </w:p>
         </w:tc>
@@ -1389,7 +1389,7 @@
                 <w:color w:val="1A1A1A"/>
                 <w:sz w:val="20"/>
               </w:rPr>
-              <w:t>Canal, conteúdo e origem sem tese. Mídia paga não cabe na margem.</w:t>
+              <w:t>Canal, conteúdo e origem sem tese. Sem cadência nem indicador.</w:t>
             </w:r>
           </w:p>
         </w:tc>
@@ -4104,7 +4104,7 @@
                 <w:color w:val="4A4A4A"/>
                 <w:sz w:val="20"/>
               </w:rPr>
-              <w:t>Ciclo de 6 meses. A máquina fica no time. Não é aluguel de agência. Mídia paga não entra neste desenho.</w:t>
+              <w:t>Ciclo de 6 meses. A máquina fica no time. Não é aluguel de agência.</w:t>
             </w:r>
           </w:p>
         </w:tc>

</xml_diff>